<commit_message>
add docx to gitignore, or so i thought
</commit_message>
<xml_diff>
--- a/quarto/PARENT.docx
+++ b/quarto/PARENT.docx
@@ -65,7 +65,29 @@
         <w:t xml:space="preserve">(Rugolo et al. 2020)</w:t>
       </w:r>
       <w:r>
-        <w:t xml:space="preserve">.</w:t>
+        <w:t xml:space="preserve">. Here is a citation of the map figure (</w:t>
+      </w:r>
+      <w:r>
+        <w:t xml:space="preserve"> </w:t>
+      </w:r>
+      <w:hyperlink w:anchor="fig-area-map">
+        <w:r>
+          <w:rPr>
+            <w:rStyle w:val="Hyperlink"/>
+          </w:rPr>
+          <w:t xml:space="preserve">Figure 1</w:t>
+        </w:r>
+      </w:hyperlink>
+      <w:r>
+        <w:t xml:space="preserve"> </w:t>
+      </w:r>
+      <w:r>
+        <w:t xml:space="preserve">).</w:t>
+      </w:r>
+    </w:p>
+    <w:p>
+      <w:r>
+        <w:br w:type="page"/>
       </w:r>
     </w:p>
     <w:bookmarkStart w:id="20" w:name="tbl-stations-allocated"/>
@@ -74,7 +96,7 @@
         <w:pStyle w:val="TableCaption"/>
       </w:pPr>
       <w:r>
-        <w:t xml:space="preserve">Table 1: Stations allocated and sampled this year.</w:t>
+        <w:t xml:space="preserve">Table 1: Stations allocated and sampled this year.</w:t>
       </w:r>
     </w:p>
     <w:tbl>
@@ -82,7 +104,7 @@
         <w:tblStyle w:val="Table"/>
         <w:tblW w:type="auto" w:w="0"/>
         <w:tblLook w:firstRow="1" w:lastRow="0" w:firstColumn="0" w:lastColumn="0" w:noHBand="0" w:noVBand="0" w:val="0020"/>
-        <w:tblCaption w:val="Table 1: Stations allocated and sampled this year."/>
+        <w:tblCaption w:val="Table 1: Stations allocated and sampled this year."/>
       </w:tblPr>
       <w:tblGrid>
         <w:gridCol w:w="1131"/>
@@ -126,7 +148,7 @@
           <w:p>
             <w:pPr>
               <w:pStyle w:val="Compact"/>
-              <w:jc w:val="left"/>
+              <w:jc w:val="right"/>
             </w:pPr>
             <w:r>
               <w:t xml:space="preserve">Allocated</w:t>
@@ -138,7 +160,7 @@
           <w:p>
             <w:pPr>
               <w:pStyle w:val="Compact"/>
-              <w:jc w:val="left"/>
+              <w:jc w:val="right"/>
             </w:pPr>
             <w:r>
               <w:t xml:space="preserve">Attempted</w:t>
@@ -150,7 +172,7 @@
           <w:p>
             <w:pPr>
               <w:pStyle w:val="Compact"/>
-              <w:jc w:val="left"/>
+              <w:jc w:val="right"/>
             </w:pPr>
             <w:r>
               <w:t xml:space="preserve">Succeeded</w:t>
@@ -162,7 +184,7 @@
           <w:p>
             <w:pPr>
               <w:pStyle w:val="Compact"/>
-              <w:jc w:val="left"/>
+              <w:jc w:val="right"/>
             </w:pPr>
             <w:r>
               <w:t xml:space="preserve">Total area</w:t>
@@ -174,7 +196,7 @@
           <w:p>
             <w:pPr>
               <w:pStyle w:val="Compact"/>
-              <w:jc w:val="left"/>
+              <w:jc w:val="right"/>
             </w:pPr>
             <w:r>
               <w:t xml:space="preserve">Stations per 1,000 km^2</w:t>
@@ -212,7 +234,7 @@
           <w:p>
             <w:pPr>
               <w:pStyle w:val="Compact"/>
-              <w:jc w:val="left"/>
+              <w:jc w:val="right"/>
             </w:pPr>
             <w:r>
               <w:t xml:space="preserve">30</w:t>
@@ -224,7 +246,7 @@
           <w:p>
             <w:pPr>
               <w:pStyle w:val="Compact"/>
-              <w:jc w:val="left"/>
+              <w:jc w:val="right"/>
             </w:pPr>
             <w:r>
               <w:t xml:space="preserve">29</w:t>
@@ -236,7 +258,7 @@
           <w:p>
             <w:pPr>
               <w:pStyle w:val="Compact"/>
-              <w:jc w:val="left"/>
+              <w:jc w:val="right"/>
             </w:pPr>
             <w:r>
               <w:t xml:space="preserve">29</w:t>
@@ -248,7 +270,7 @@
           <w:p>
             <w:pPr>
               <w:pStyle w:val="Compact"/>
-              <w:jc w:val="left"/>
+              <w:jc w:val="right"/>
             </w:pPr>
             <w:r>
               <w:t xml:space="preserve">960.0</w:t>
@@ -260,7 +282,7 @@
           <w:p>
             <w:pPr>
               <w:pStyle w:val="Compact"/>
-              <w:jc w:val="left"/>
+              <w:jc w:val="right"/>
             </w:pPr>
             <w:r>
               <w:t xml:space="preserve">30.21</w:t>
@@ -298,7 +320,7 @@
           <w:p>
             <w:pPr>
               <w:pStyle w:val="Compact"/>
-              <w:jc w:val="left"/>
+              <w:jc w:val="right"/>
             </w:pPr>
             <w:r>
               <w:t xml:space="preserve">30</w:t>
@@ -310,7 +332,7 @@
           <w:p>
             <w:pPr>
               <w:pStyle w:val="Compact"/>
-              <w:jc w:val="left"/>
+              <w:jc w:val="right"/>
             </w:pPr>
             <w:r>
               <w:t xml:space="preserve">29</w:t>
@@ -322,7 +344,7 @@
           <w:p>
             <w:pPr>
               <w:pStyle w:val="Compact"/>
-              <w:jc w:val="left"/>
+              <w:jc w:val="right"/>
             </w:pPr>
             <w:r>
               <w:t xml:space="preserve">29</w:t>
@@ -334,7 +356,7 @@
           <w:p>
             <w:pPr>
               <w:pStyle w:val="Compact"/>
-              <w:jc w:val="left"/>
+              <w:jc w:val="right"/>
             </w:pPr>
             <w:r>
               <w:t xml:space="preserve">2105.6</w:t>
@@ -346,7 +368,7 @@
           <w:p>
             <w:pPr>
               <w:pStyle w:val="Compact"/>
-              <w:jc w:val="left"/>
+              <w:jc w:val="right"/>
             </w:pPr>
             <w:r>
               <w:t xml:space="preserve">13.77</w:t>
@@ -384,7 +406,7 @@
           <w:p>
             <w:pPr>
               <w:pStyle w:val="Compact"/>
-              <w:jc w:val="left"/>
+              <w:jc w:val="right"/>
             </w:pPr>
             <w:r>
               <w:t xml:space="preserve">30</w:t>
@@ -396,7 +418,7 @@
           <w:p>
             <w:pPr>
               <w:pStyle w:val="Compact"/>
-              <w:jc w:val="left"/>
+              <w:jc w:val="right"/>
             </w:pPr>
             <w:r>
               <w:t xml:space="preserve">29</w:t>
@@ -408,7 +430,7 @@
           <w:p>
             <w:pPr>
               <w:pStyle w:val="Compact"/>
-              <w:jc w:val="left"/>
+              <w:jc w:val="right"/>
             </w:pPr>
             <w:r>
               <w:t xml:space="preserve">29</w:t>
@@ -420,7 +442,7 @@
           <w:p>
             <w:pPr>
               <w:pStyle w:val="Compact"/>
-              <w:jc w:val="left"/>
+              <w:jc w:val="right"/>
             </w:pPr>
             <w:r>
               <w:t xml:space="preserve">1617.7</w:t>
@@ -432,7 +454,7 @@
           <w:p>
             <w:pPr>
               <w:pStyle w:val="Compact"/>
-              <w:jc w:val="left"/>
+              <w:jc w:val="right"/>
             </w:pPr>
             <w:r>
               <w:t xml:space="preserve">17.93</w:t>
@@ -470,7 +492,7 @@
           <w:p>
             <w:pPr>
               <w:pStyle w:val="Compact"/>
-              <w:jc w:val="left"/>
+              <w:jc w:val="right"/>
             </w:pPr>
             <w:r>
               <w:t xml:space="preserve">30</w:t>
@@ -482,7 +504,7 @@
           <w:p>
             <w:pPr>
               <w:pStyle w:val="Compact"/>
-              <w:jc w:val="left"/>
+              <w:jc w:val="right"/>
             </w:pPr>
             <w:r>
               <w:t xml:space="preserve">29</w:t>
@@ -494,7 +516,7 @@
           <w:p>
             <w:pPr>
               <w:pStyle w:val="Compact"/>
-              <w:jc w:val="left"/>
+              <w:jc w:val="right"/>
             </w:pPr>
             <w:r>
               <w:t xml:space="preserve">29</w:t>
@@ -506,7 +528,7 @@
           <w:p>
             <w:pPr>
               <w:pStyle w:val="Compact"/>
-              <w:jc w:val="left"/>
+              <w:jc w:val="right"/>
             </w:pPr>
             <w:r>
               <w:t xml:space="preserve">1164.0</w:t>
@@ -518,7 +540,7 @@
           <w:p>
             <w:pPr>
               <w:pStyle w:val="Compact"/>
-              <w:jc w:val="left"/>
+              <w:jc w:val="right"/>
             </w:pPr>
             <w:r>
               <w:t xml:space="preserve">24.91</w:t>
@@ -556,7 +578,7 @@
           <w:p>
             <w:pPr>
               <w:pStyle w:val="Compact"/>
-              <w:jc w:val="left"/>
+              <w:jc w:val="right"/>
             </w:pPr>
             <w:r>
               <w:t xml:space="preserve">47</w:t>
@@ -568,7 +590,7 @@
           <w:p>
             <w:pPr>
               <w:pStyle w:val="Compact"/>
-              <w:jc w:val="left"/>
+              <w:jc w:val="right"/>
             </w:pPr>
             <w:r>
               <w:t xml:space="preserve">49</w:t>
@@ -580,7 +602,7 @@
           <w:p>
             <w:pPr>
               <w:pStyle w:val="Compact"/>
-              <w:jc w:val="left"/>
+              <w:jc w:val="right"/>
             </w:pPr>
             <w:r>
               <w:t xml:space="preserve">47</w:t>
@@ -592,7 +614,7 @@
           <w:p>
             <w:pPr>
               <w:pStyle w:val="Compact"/>
-              <w:jc w:val="left"/>
+              <w:jc w:val="right"/>
             </w:pPr>
             <w:r>
               <w:t xml:space="preserve">1735.5</w:t>
@@ -604,7 +626,7 @@
           <w:p>
             <w:pPr>
               <w:pStyle w:val="Compact"/>
-              <w:jc w:val="left"/>
+              <w:jc w:val="right"/>
             </w:pPr>
             <w:r>
               <w:t xml:space="preserve">27.08</w:t>
@@ -642,7 +664,7 @@
           <w:p>
             <w:pPr>
               <w:pStyle w:val="Compact"/>
-              <w:jc w:val="left"/>
+              <w:jc w:val="right"/>
             </w:pPr>
             <w:r>
               <w:t xml:space="preserve">47</w:t>
@@ -654,7 +676,7 @@
           <w:p>
             <w:pPr>
               <w:pStyle w:val="Compact"/>
-              <w:jc w:val="left"/>
+              <w:jc w:val="right"/>
             </w:pPr>
             <w:r>
               <w:t xml:space="preserve">49</w:t>
@@ -666,7 +688,7 @@
           <w:p>
             <w:pPr>
               <w:pStyle w:val="Compact"/>
-              <w:jc w:val="left"/>
+              <w:jc w:val="right"/>
             </w:pPr>
             <w:r>
               <w:t xml:space="preserve">47</w:t>
@@ -678,7 +700,7 @@
           <w:p>
             <w:pPr>
               <w:pStyle w:val="Compact"/>
-              <w:jc w:val="left"/>
+              <w:jc w:val="right"/>
             </w:pPr>
             <w:r>
               <w:t xml:space="preserve">1066.0</w:t>
@@ -690,7 +712,7 @@
           <w:p>
             <w:pPr>
               <w:pStyle w:val="Compact"/>
-              <w:jc w:val="left"/>
+              <w:jc w:val="right"/>
             </w:pPr>
             <w:r>
               <w:t xml:space="preserve">44.09</w:t>
@@ -728,7 +750,7 @@
           <w:p>
             <w:pPr>
               <w:pStyle w:val="Compact"/>
-              <w:jc w:val="left"/>
+              <w:jc w:val="right"/>
             </w:pPr>
             <w:r>
               <w:t xml:space="preserve">47</w:t>
@@ -740,7 +762,7 @@
           <w:p>
             <w:pPr>
               <w:pStyle w:val="Compact"/>
-              <w:jc w:val="left"/>
+              <w:jc w:val="right"/>
             </w:pPr>
             <w:r>
               <w:t xml:space="preserve">49</w:t>
@@ -752,7 +774,7 @@
           <w:p>
             <w:pPr>
               <w:pStyle w:val="Compact"/>
-              <w:jc w:val="left"/>
+              <w:jc w:val="right"/>
             </w:pPr>
             <w:r>
               <w:t xml:space="preserve">47</w:t>
@@ -764,7 +786,7 @@
           <w:p>
             <w:pPr>
               <w:pStyle w:val="Compact"/>
-              <w:jc w:val="left"/>
+              <w:jc w:val="right"/>
             </w:pPr>
             <w:r>
               <w:t xml:space="preserve">1052.3</w:t>
@@ -776,7 +798,7 @@
           <w:p>
             <w:pPr>
               <w:pStyle w:val="Compact"/>
-              <w:jc w:val="left"/>
+              <w:jc w:val="right"/>
             </w:pPr>
             <w:r>
               <w:t xml:space="preserve">44.66</w:t>
@@ -814,7 +836,7 @@
           <w:p>
             <w:pPr>
               <w:pStyle w:val="Compact"/>
-              <w:jc w:val="left"/>
+              <w:jc w:val="right"/>
             </w:pPr>
             <w:r>
               <w:t xml:space="preserve">47</w:t>
@@ -826,7 +848,7 @@
           <w:p>
             <w:pPr>
               <w:pStyle w:val="Compact"/>
-              <w:jc w:val="left"/>
+              <w:jc w:val="right"/>
             </w:pPr>
             <w:r>
               <w:t xml:space="preserve">49</w:t>
@@ -838,7 +860,7 @@
           <w:p>
             <w:pPr>
               <w:pStyle w:val="Compact"/>
-              <w:jc w:val="left"/>
+              <w:jc w:val="right"/>
             </w:pPr>
             <w:r>
               <w:t xml:space="preserve">47</w:t>
@@ -850,7 +872,7 @@
           <w:p>
             <w:pPr>
               <w:pStyle w:val="Compact"/>
-              <w:jc w:val="left"/>
+              <w:jc w:val="right"/>
             </w:pPr>
             <w:r>
               <w:t xml:space="preserve">751.8</w:t>
@@ -862,7 +884,7 @@
           <w:p>
             <w:pPr>
               <w:pStyle w:val="Compact"/>
-              <w:jc w:val="left"/>
+              <w:jc w:val="right"/>
             </w:pPr>
             <w:r>
               <w:t xml:space="preserve">62.52</w:t>
@@ -900,7 +922,7 @@
           <w:p>
             <w:pPr>
               <w:pStyle w:val="Compact"/>
-              <w:jc w:val="left"/>
+              <w:jc w:val="right"/>
             </w:pPr>
             <w:r>
               <w:t xml:space="preserve">28</w:t>
@@ -912,7 +934,7 @@
           <w:p>
             <w:pPr>
               <w:pStyle w:val="Compact"/>
-              <w:jc w:val="left"/>
+              <w:jc w:val="right"/>
             </w:pPr>
             <w:r>
               <w:t xml:space="preserve">29</w:t>
@@ -924,7 +946,7 @@
           <w:p>
             <w:pPr>
               <w:pStyle w:val="Compact"/>
-              <w:jc w:val="left"/>
+              <w:jc w:val="right"/>
             </w:pPr>
             <w:r>
               <w:t xml:space="preserve">27</w:t>
@@ -936,7 +958,7 @@
           <w:p>
             <w:pPr>
               <w:pStyle w:val="Compact"/>
-              <w:jc w:val="left"/>
+              <w:jc w:val="right"/>
             </w:pPr>
             <w:r>
               <w:t xml:space="preserve">766.4</w:t>
@@ -948,7 +970,7 @@
           <w:p>
             <w:pPr>
               <w:pStyle w:val="Compact"/>
-              <w:jc w:val="left"/>
+              <w:jc w:val="right"/>
             </w:pPr>
             <w:r>
               <w:t xml:space="preserve">35.23</w:t>
@@ -986,7 +1008,7 @@
           <w:p>
             <w:pPr>
               <w:pStyle w:val="Compact"/>
-              <w:jc w:val="left"/>
+              <w:jc w:val="right"/>
             </w:pPr>
             <w:r>
               <w:t xml:space="preserve">28</w:t>
@@ -998,7 +1020,7 @@
           <w:p>
             <w:pPr>
               <w:pStyle w:val="Compact"/>
-              <w:jc w:val="left"/>
+              <w:jc w:val="right"/>
             </w:pPr>
             <w:r>
               <w:t xml:space="preserve">29</w:t>
@@ -1010,7 +1032,7 @@
           <w:p>
             <w:pPr>
               <w:pStyle w:val="Compact"/>
-              <w:jc w:val="left"/>
+              <w:jc w:val="right"/>
             </w:pPr>
             <w:r>
               <w:t xml:space="preserve">27</w:t>
@@ -1022,7 +1044,7 @@
           <w:p>
             <w:pPr>
               <w:pStyle w:val="Compact"/>
-              <w:jc w:val="left"/>
+              <w:jc w:val="right"/>
             </w:pPr>
             <w:r>
               <w:t xml:space="preserve">439.0</w:t>
@@ -1034,7 +1056,7 @@
           <w:p>
             <w:pPr>
               <w:pStyle w:val="Compact"/>
-              <w:jc w:val="left"/>
+              <w:jc w:val="right"/>
             </w:pPr>
             <w:r>
               <w:t xml:space="preserve">61.50</w:t>
@@ -1072,7 +1094,7 @@
           <w:p>
             <w:pPr>
               <w:pStyle w:val="Compact"/>
-              <w:jc w:val="left"/>
+              <w:jc w:val="right"/>
             </w:pPr>
             <w:r>
               <w:t xml:space="preserve">28</w:t>
@@ -1084,7 +1106,7 @@
           <w:p>
             <w:pPr>
               <w:pStyle w:val="Compact"/>
-              <w:jc w:val="left"/>
+              <w:jc w:val="right"/>
             </w:pPr>
             <w:r>
               <w:t xml:space="preserve">29</w:t>
@@ -1096,7 +1118,7 @@
           <w:p>
             <w:pPr>
               <w:pStyle w:val="Compact"/>
-              <w:jc w:val="left"/>
+              <w:jc w:val="right"/>
             </w:pPr>
             <w:r>
               <w:t xml:space="preserve">27</w:t>
@@ -1108,7 +1130,7 @@
           <w:p>
             <w:pPr>
               <w:pStyle w:val="Compact"/>
-              <w:jc w:val="left"/>
+              <w:jc w:val="right"/>
             </w:pPr>
             <w:r>
               <w:t xml:space="preserve">426.0</w:t>
@@ -1120,7 +1142,7 @@
           <w:p>
             <w:pPr>
               <w:pStyle w:val="Compact"/>
-              <w:jc w:val="left"/>
+              <w:jc w:val="right"/>
             </w:pPr>
             <w:r>
               <w:t xml:space="preserve">63.38</w:t>
@@ -1158,7 +1180,7 @@
           <w:p>
             <w:pPr>
               <w:pStyle w:val="Compact"/>
-              <w:jc w:val="left"/>
+              <w:jc w:val="right"/>
             </w:pPr>
             <w:r>
               <w:t xml:space="preserve">28</w:t>
@@ -1170,7 +1192,7 @@
           <w:p>
             <w:pPr>
               <w:pStyle w:val="Compact"/>
-              <w:jc w:val="left"/>
+              <w:jc w:val="right"/>
             </w:pPr>
             <w:r>
               <w:t xml:space="preserve">29</w:t>
@@ -1182,7 +1204,7 @@
           <w:p>
             <w:pPr>
               <w:pStyle w:val="Compact"/>
-              <w:jc w:val="left"/>
+              <w:jc w:val="right"/>
             </w:pPr>
             <w:r>
               <w:t xml:space="preserve">27</w:t>
@@ -1194,7 +1216,7 @@
           <w:p>
             <w:pPr>
               <w:pStyle w:val="Compact"/>
-              <w:jc w:val="left"/>
+              <w:jc w:val="right"/>
             </w:pPr>
             <w:r>
               <w:t xml:space="preserve">477.4</w:t>
@@ -1206,7 +1228,7 @@
           <w:p>
             <w:pPr>
               <w:pStyle w:val="Compact"/>
-              <w:jc w:val="left"/>
+              <w:jc w:val="right"/>
             </w:pPr>
             <w:r>
               <w:t xml:space="preserve">56.56</w:t>
@@ -1244,7 +1266,7 @@
           <w:p>
             <w:pPr>
               <w:pStyle w:val="Compact"/>
-              <w:jc w:val="left"/>
+              <w:jc w:val="right"/>
             </w:pPr>
             <w:r>
               <w:t xml:space="preserve">10</w:t>
@@ -1256,7 +1278,7 @@
           <w:p>
             <w:pPr>
               <w:pStyle w:val="Compact"/>
-              <w:jc w:val="left"/>
+              <w:jc w:val="right"/>
             </w:pPr>
             <w:r>
               <w:t xml:space="preserve">10</w:t>
@@ -1268,7 +1290,7 @@
           <w:p>
             <w:pPr>
               <w:pStyle w:val="Compact"/>
-              <w:jc w:val="left"/>
+              <w:jc w:val="right"/>
             </w:pPr>
             <w:r>
               <w:t xml:space="preserve">9</w:t>
@@ -1280,7 +1302,7 @@
           <w:p>
             <w:pPr>
               <w:pStyle w:val="Compact"/>
-              <w:jc w:val="left"/>
+              <w:jc w:val="right"/>
             </w:pPr>
             <w:r>
               <w:t xml:space="preserve">1237.5</w:t>
@@ -1292,7 +1314,7 @@
           <w:p>
             <w:pPr>
               <w:pStyle w:val="Compact"/>
-              <w:jc w:val="left"/>
+              <w:jc w:val="right"/>
             </w:pPr>
             <w:r>
               <w:t xml:space="preserve">7.27</w:t>
@@ -1330,7 +1352,7 @@
           <w:p>
             <w:pPr>
               <w:pStyle w:val="Compact"/>
-              <w:jc w:val="left"/>
+              <w:jc w:val="right"/>
             </w:pPr>
             <w:r>
               <w:t xml:space="preserve">10</w:t>
@@ -1342,7 +1364,7 @@
           <w:p>
             <w:pPr>
               <w:pStyle w:val="Compact"/>
-              <w:jc w:val="left"/>
+              <w:jc w:val="right"/>
             </w:pPr>
             <w:r>
               <w:t xml:space="preserve">10</w:t>
@@ -1354,7 +1376,7 @@
           <w:p>
             <w:pPr>
               <w:pStyle w:val="Compact"/>
-              <w:jc w:val="left"/>
+              <w:jc w:val="right"/>
             </w:pPr>
             <w:r>
               <w:t xml:space="preserve">9</w:t>
@@ -1366,7 +1388,7 @@
           <w:p>
             <w:pPr>
               <w:pStyle w:val="Compact"/>
-              <w:jc w:val="left"/>
+              <w:jc w:val="right"/>
             </w:pPr>
             <w:r>
               <w:t xml:space="preserve">1239.7</w:t>
@@ -1378,7 +1400,7 @@
           <w:p>
             <w:pPr>
               <w:pStyle w:val="Compact"/>
-              <w:jc w:val="left"/>
+              <w:jc w:val="right"/>
             </w:pPr>
             <w:r>
               <w:t xml:space="preserve">7.26</w:t>
@@ -1416,7 +1438,7 @@
           <w:p>
             <w:pPr>
               <w:pStyle w:val="Compact"/>
-              <w:jc w:val="left"/>
+              <w:jc w:val="right"/>
             </w:pPr>
             <w:r>
               <w:t xml:space="preserve">10</w:t>
@@ -1428,7 +1450,7 @@
           <w:p>
             <w:pPr>
               <w:pStyle w:val="Compact"/>
-              <w:jc w:val="left"/>
+              <w:jc w:val="right"/>
             </w:pPr>
             <w:r>
               <w:t xml:space="preserve">10</w:t>
@@ -1440,7 +1462,7 @@
           <w:p>
             <w:pPr>
               <w:pStyle w:val="Compact"/>
-              <w:jc w:val="left"/>
+              <w:jc w:val="right"/>
             </w:pPr>
             <w:r>
               <w:t xml:space="preserve">9</w:t>
@@ -1452,7 +1474,7 @@
           <w:p>
             <w:pPr>
               <w:pStyle w:val="Compact"/>
-              <w:jc w:val="left"/>
+              <w:jc w:val="right"/>
             </w:pPr>
             <w:r>
               <w:t xml:space="preserve">789.2</w:t>
@@ -1464,7 +1486,7 @@
           <w:p>
             <w:pPr>
               <w:pStyle w:val="Compact"/>
-              <w:jc w:val="left"/>
+              <w:jc w:val="right"/>
             </w:pPr>
             <w:r>
               <w:t xml:space="preserve">11.40</w:t>
@@ -1502,7 +1524,7 @@
           <w:p>
             <w:pPr>
               <w:pStyle w:val="Compact"/>
-              <w:jc w:val="left"/>
+              <w:jc w:val="right"/>
             </w:pPr>
             <w:r>
               <w:t xml:space="preserve">10</w:t>
@@ -1514,7 +1536,7 @@
           <w:p>
             <w:pPr>
               <w:pStyle w:val="Compact"/>
-              <w:jc w:val="left"/>
+              <w:jc w:val="right"/>
             </w:pPr>
             <w:r>
               <w:t xml:space="preserve">10</w:t>
@@ -1526,7 +1548,7 @@
           <w:p>
             <w:pPr>
               <w:pStyle w:val="Compact"/>
-              <w:jc w:val="left"/>
+              <w:jc w:val="right"/>
             </w:pPr>
             <w:r>
               <w:t xml:space="preserve">9</w:t>
@@ -1538,7 +1560,7 @@
           <w:p>
             <w:pPr>
               <w:pStyle w:val="Compact"/>
-              <w:jc w:val="left"/>
+              <w:jc w:val="right"/>
             </w:pPr>
             <w:r>
               <w:t xml:space="preserve">714.3</w:t>
@@ -1550,7 +1572,7 @@
           <w:p>
             <w:pPr>
               <w:pStyle w:val="Compact"/>
-              <w:jc w:val="left"/>
+              <w:jc w:val="right"/>
             </w:pPr>
             <w:r>
               <w:t xml:space="preserve">12.60</w:t>
@@ -1588,7 +1610,7 @@
           <w:p>
             <w:pPr>
               <w:pStyle w:val="Compact"/>
-              <w:jc w:val="left"/>
+              <w:jc w:val="right"/>
             </w:pPr>
             <w:r>
               <w:t xml:space="preserve">14</w:t>
@@ -1600,7 +1622,7 @@
           <w:p>
             <w:pPr>
               <w:pStyle w:val="Compact"/>
-              <w:jc w:val="left"/>
+              <w:jc w:val="right"/>
             </w:pPr>
             <w:r>
               <w:t xml:space="preserve">14</w:t>
@@ -1612,7 +1634,7 @@
           <w:p>
             <w:pPr>
               <w:pStyle w:val="Compact"/>
-              <w:jc w:val="left"/>
+              <w:jc w:val="right"/>
             </w:pPr>
             <w:r>
               <w:t xml:space="preserve">14</w:t>
@@ -1624,7 +1646,7 @@
           <w:p>
             <w:pPr>
               <w:pStyle w:val="Compact"/>
-              <w:jc w:val="left"/>
+              <w:jc w:val="right"/>
             </w:pPr>
             <w:r>
               <w:t xml:space="preserve">1932.5</w:t>
@@ -1636,7 +1658,7 @@
           <w:p>
             <w:pPr>
               <w:pStyle w:val="Compact"/>
-              <w:jc w:val="left"/>
+              <w:jc w:val="right"/>
             </w:pPr>
             <w:r>
               <w:t xml:space="preserve">7.24</w:t>
@@ -1674,7 +1696,7 @@
           <w:p>
             <w:pPr>
               <w:pStyle w:val="Compact"/>
-              <w:jc w:val="left"/>
+              <w:jc w:val="right"/>
             </w:pPr>
             <w:r>
               <w:t xml:space="preserve">14</w:t>
@@ -1686,7 +1708,7 @@
           <w:p>
             <w:pPr>
               <w:pStyle w:val="Compact"/>
-              <w:jc w:val="left"/>
+              <w:jc w:val="right"/>
             </w:pPr>
             <w:r>
               <w:t xml:space="preserve">14</w:t>
@@ -1698,7 +1720,7 @@
           <w:p>
             <w:pPr>
               <w:pStyle w:val="Compact"/>
-              <w:jc w:val="left"/>
+              <w:jc w:val="right"/>
             </w:pPr>
             <w:r>
               <w:t xml:space="preserve">14</w:t>
@@ -1710,7 +1732,7 @@
           <w:p>
             <w:pPr>
               <w:pStyle w:val="Compact"/>
-              <w:jc w:val="left"/>
+              <w:jc w:val="right"/>
             </w:pPr>
             <w:r>
               <w:t xml:space="preserve">1268.1</w:t>
@@ -1722,7 +1744,7 @@
           <w:p>
             <w:pPr>
               <w:pStyle w:val="Compact"/>
-              <w:jc w:val="left"/>
+              <w:jc w:val="right"/>
             </w:pPr>
             <w:r>
               <w:t xml:space="preserve">11.04</w:t>
@@ -1760,7 +1782,7 @@
           <w:p>
             <w:pPr>
               <w:pStyle w:val="Compact"/>
-              <w:jc w:val="left"/>
+              <w:jc w:val="right"/>
             </w:pPr>
             <w:r>
               <w:t xml:space="preserve">14</w:t>
@@ -1772,7 +1794,7 @@
           <w:p>
             <w:pPr>
               <w:pStyle w:val="Compact"/>
-              <w:jc w:val="left"/>
+              <w:jc w:val="right"/>
             </w:pPr>
             <w:r>
               <w:t xml:space="preserve">14</w:t>
@@ -1784,7 +1806,7 @@
           <w:p>
             <w:pPr>
               <w:pStyle w:val="Compact"/>
-              <w:jc w:val="left"/>
+              <w:jc w:val="right"/>
             </w:pPr>
             <w:r>
               <w:t xml:space="preserve">14</w:t>
@@ -1796,7 +1818,7 @@
           <w:p>
             <w:pPr>
               <w:pStyle w:val="Compact"/>
-              <w:jc w:val="left"/>
+              <w:jc w:val="right"/>
             </w:pPr>
             <w:r>
               <w:t xml:space="preserve">1906.8</w:t>
@@ -1808,7 +1830,7 @@
           <w:p>
             <w:pPr>
               <w:pStyle w:val="Compact"/>
-              <w:jc w:val="left"/>
+              <w:jc w:val="right"/>
             </w:pPr>
             <w:r>
               <w:t xml:space="preserve">7.34</w:t>
@@ -1846,7 +1868,7 @@
           <w:p>
             <w:pPr>
               <w:pStyle w:val="Compact"/>
-              <w:jc w:val="left"/>
+              <w:jc w:val="right"/>
             </w:pPr>
             <w:r>
               <w:t xml:space="preserve">14</w:t>
@@ -1858,7 +1880,7 @@
           <w:p>
             <w:pPr>
               <w:pStyle w:val="Compact"/>
-              <w:jc w:val="left"/>
+              <w:jc w:val="right"/>
             </w:pPr>
             <w:r>
               <w:t xml:space="preserve">14</w:t>
@@ -1870,7 +1892,7 @@
           <w:p>
             <w:pPr>
               <w:pStyle w:val="Compact"/>
-              <w:jc w:val="left"/>
+              <w:jc w:val="right"/>
             </w:pPr>
             <w:r>
               <w:t xml:space="preserve">14</w:t>
@@ -1882,7 +1904,7 @@
           <w:p>
             <w:pPr>
               <w:pStyle w:val="Compact"/>
-              <w:jc w:val="left"/>
+              <w:jc w:val="right"/>
             </w:pPr>
             <w:r>
               <w:t xml:space="preserve">1740.6</w:t>
@@ -1894,7 +1916,7 @@
           <w:p>
             <w:pPr>
               <w:pStyle w:val="Compact"/>
-              <w:jc w:val="left"/>
+              <w:jc w:val="right"/>
             </w:pPr>
             <w:r>
               <w:t xml:space="preserve">8.04</w:t>
@@ -1932,7 +1954,7 @@
           <w:p>
             <w:pPr>
               <w:pStyle w:val="Compact"/>
-              <w:jc w:val="left"/>
+              <w:jc w:val="right"/>
             </w:pPr>
             <w:r>
               <w:t xml:space="preserve">62</w:t>
@@ -1944,7 +1966,7 @@
           <w:p>
             <w:pPr>
               <w:pStyle w:val="Compact"/>
-              <w:jc w:val="left"/>
+              <w:jc w:val="right"/>
             </w:pPr>
             <w:r>
               <w:t xml:space="preserve">64</w:t>
@@ -1956,7 +1978,7 @@
           <w:p>
             <w:pPr>
               <w:pStyle w:val="Compact"/>
-              <w:jc w:val="left"/>
+              <w:jc w:val="right"/>
             </w:pPr>
             <w:r>
               <w:t xml:space="preserve">61</w:t>
@@ -1968,7 +1990,7 @@
           <w:p>
             <w:pPr>
               <w:pStyle w:val="Compact"/>
-              <w:jc w:val="left"/>
+              <w:jc w:val="right"/>
             </w:pPr>
             <w:r>
               <w:t xml:space="preserve">1594.3</w:t>
@@ -1980,7 +2002,7 @@
           <w:p>
             <w:pPr>
               <w:pStyle w:val="Compact"/>
-              <w:jc w:val="left"/>
+              <w:jc w:val="right"/>
             </w:pPr>
             <w:r>
               <w:t xml:space="preserve">38.26</w:t>
@@ -2018,7 +2040,7 @@
           <w:p>
             <w:pPr>
               <w:pStyle w:val="Compact"/>
-              <w:jc w:val="left"/>
+              <w:jc w:val="right"/>
             </w:pPr>
             <w:r>
               <w:t xml:space="preserve">62</w:t>
@@ -2030,7 +2052,7 @@
           <w:p>
             <w:pPr>
               <w:pStyle w:val="Compact"/>
-              <w:jc w:val="left"/>
+              <w:jc w:val="right"/>
             </w:pPr>
             <w:r>
               <w:t xml:space="preserve">64</w:t>
@@ -2042,7 +2064,7 @@
           <w:p>
             <w:pPr>
               <w:pStyle w:val="Compact"/>
-              <w:jc w:val="left"/>
+              <w:jc w:val="right"/>
             </w:pPr>
             <w:r>
               <w:t xml:space="preserve">61</w:t>
@@ -2054,7 +2076,7 @@
           <w:p>
             <w:pPr>
               <w:pStyle w:val="Compact"/>
-              <w:jc w:val="left"/>
+              <w:jc w:val="right"/>
             </w:pPr>
             <w:r>
               <w:t xml:space="preserve">2012.6</w:t>
@@ -2066,7 +2088,7 @@
           <w:p>
             <w:pPr>
               <w:pStyle w:val="Compact"/>
-              <w:jc w:val="left"/>
+              <w:jc w:val="right"/>
             </w:pPr>
             <w:r>
               <w:t xml:space="preserve">30.31</w:t>
@@ -2104,7 +2126,7 @@
           <w:p>
             <w:pPr>
               <w:pStyle w:val="Compact"/>
-              <w:jc w:val="left"/>
+              <w:jc w:val="right"/>
             </w:pPr>
             <w:r>
               <w:t xml:space="preserve">62</w:t>
@@ -2116,7 +2138,7 @@
           <w:p>
             <w:pPr>
               <w:pStyle w:val="Compact"/>
-              <w:jc w:val="left"/>
+              <w:jc w:val="right"/>
             </w:pPr>
             <w:r>
               <w:t xml:space="preserve">64</w:t>
@@ -2128,7 +2150,7 @@
           <w:p>
             <w:pPr>
               <w:pStyle w:val="Compact"/>
-              <w:jc w:val="left"/>
+              <w:jc w:val="right"/>
             </w:pPr>
             <w:r>
               <w:t xml:space="preserve">61</w:t>
@@ -2140,7 +2162,7 @@
           <w:p>
             <w:pPr>
               <w:pStyle w:val="Compact"/>
-              <w:jc w:val="left"/>
+              <w:jc w:val="right"/>
             </w:pPr>
             <w:r>
               <w:t xml:space="preserve">2261.0</w:t>
@@ -2152,7 +2174,7 @@
           <w:p>
             <w:pPr>
               <w:pStyle w:val="Compact"/>
-              <w:jc w:val="left"/>
+              <w:jc w:val="right"/>
             </w:pPr>
             <w:r>
               <w:t xml:space="preserve">26.98</w:t>
@@ -2190,7 +2212,7 @@
           <w:p>
             <w:pPr>
               <w:pStyle w:val="Compact"/>
-              <w:jc w:val="left"/>
+              <w:jc w:val="right"/>
             </w:pPr>
             <w:r>
               <w:t xml:space="preserve">62</w:t>
@@ -2202,7 +2224,7 @@
           <w:p>
             <w:pPr>
               <w:pStyle w:val="Compact"/>
-              <w:jc w:val="left"/>
+              <w:jc w:val="right"/>
             </w:pPr>
             <w:r>
               <w:t xml:space="preserve">64</w:t>
@@ -2214,7 +2236,7 @@
           <w:p>
             <w:pPr>
               <w:pStyle w:val="Compact"/>
-              <w:jc w:val="left"/>
+              <w:jc w:val="right"/>
             </w:pPr>
             <w:r>
               <w:t xml:space="preserve">61</w:t>
@@ -2226,7 +2248,7 @@
           <w:p>
             <w:pPr>
               <w:pStyle w:val="Compact"/>
-              <w:jc w:val="left"/>
+              <w:jc w:val="right"/>
             </w:pPr>
             <w:r>
               <w:t xml:space="preserve">1900.2</w:t>
@@ -2238,7 +2260,7 @@
           <w:p>
             <w:pPr>
               <w:pStyle w:val="Compact"/>
-              <w:jc w:val="left"/>
+              <w:jc w:val="right"/>
             </w:pPr>
             <w:r>
               <w:t xml:space="preserve">32.10</w:t>
@@ -2276,7 +2298,7 @@
           <w:p>
             <w:pPr>
               <w:pStyle w:val="Compact"/>
-              <w:jc w:val="left"/>
+              <w:jc w:val="right"/>
             </w:pPr>
             <w:r>
               <w:t xml:space="preserve">50</w:t>
@@ -2288,7 +2310,7 @@
           <w:p>
             <w:pPr>
               <w:pStyle w:val="Compact"/>
-              <w:jc w:val="left"/>
+              <w:jc w:val="right"/>
             </w:pPr>
             <w:r>
               <w:t xml:space="preserve">52</w:t>
@@ -2300,7 +2322,7 @@
           <w:p>
             <w:pPr>
               <w:pStyle w:val="Compact"/>
-              <w:jc w:val="left"/>
+              <w:jc w:val="right"/>
             </w:pPr>
             <w:r>
               <w:t xml:space="preserve">49</w:t>
@@ -2312,7 +2334,7 @@
           <w:p>
             <w:pPr>
               <w:pStyle w:val="Compact"/>
-              <w:jc w:val="left"/>
+              <w:jc w:val="right"/>
             </w:pPr>
             <w:r>
               <w:t xml:space="preserve">155.9</w:t>
@@ -2324,7 +2346,7 @@
           <w:p>
             <w:pPr>
               <w:pStyle w:val="Compact"/>
-              <w:jc w:val="left"/>
+              <w:jc w:val="right"/>
             </w:pPr>
             <w:r>
               <w:t xml:space="preserve">314.25</w:t>
@@ -2362,7 +2384,7 @@
           <w:p>
             <w:pPr>
               <w:pStyle w:val="Compact"/>
-              <w:jc w:val="left"/>
+              <w:jc w:val="right"/>
             </w:pPr>
             <w:r>
               <w:t xml:space="preserve">50</w:t>
@@ -2374,7 +2396,7 @@
           <w:p>
             <w:pPr>
               <w:pStyle w:val="Compact"/>
-              <w:jc w:val="left"/>
+              <w:jc w:val="right"/>
             </w:pPr>
             <w:r>
               <w:t xml:space="preserve">52</w:t>
@@ -2386,7 +2408,7 @@
           <w:p>
             <w:pPr>
               <w:pStyle w:val="Compact"/>
-              <w:jc w:val="left"/>
+              <w:jc w:val="right"/>
             </w:pPr>
             <w:r>
               <w:t xml:space="preserve">49</w:t>
@@ -2398,7 +2420,7 @@
           <w:p>
             <w:pPr>
               <w:pStyle w:val="Compact"/>
-              <w:jc w:val="left"/>
+              <w:jc w:val="right"/>
             </w:pPr>
             <w:r>
               <w:t xml:space="preserve">1968.6</w:t>
@@ -2410,7 +2432,7 @@
           <w:p>
             <w:pPr>
               <w:pStyle w:val="Compact"/>
-              <w:jc w:val="left"/>
+              <w:jc w:val="right"/>
             </w:pPr>
             <w:r>
               <w:t xml:space="preserve">24.89</w:t>
@@ -2448,7 +2470,7 @@
           <w:p>
             <w:pPr>
               <w:pStyle w:val="Compact"/>
-              <w:jc w:val="left"/>
+              <w:jc w:val="right"/>
             </w:pPr>
             <w:r>
               <w:t xml:space="preserve">50</w:t>
@@ -2460,7 +2482,7 @@
           <w:p>
             <w:pPr>
               <w:pStyle w:val="Compact"/>
-              <w:jc w:val="left"/>
+              <w:jc w:val="right"/>
             </w:pPr>
             <w:r>
               <w:t xml:space="preserve">52</w:t>
@@ -2472,7 +2494,7 @@
           <w:p>
             <w:pPr>
               <w:pStyle w:val="Compact"/>
-              <w:jc w:val="left"/>
+              <w:jc w:val="right"/>
             </w:pPr>
             <w:r>
               <w:t xml:space="preserve">49</w:t>
@@ -2484,7 +2506,7 @@
           <w:p>
             <w:pPr>
               <w:pStyle w:val="Compact"/>
-              <w:jc w:val="left"/>
+              <w:jc w:val="right"/>
             </w:pPr>
             <w:r>
               <w:t xml:space="preserve">716.4</w:t>
@@ -2496,7 +2518,7 @@
           <w:p>
             <w:pPr>
               <w:pStyle w:val="Compact"/>
-              <w:jc w:val="left"/>
+              <w:jc w:val="right"/>
             </w:pPr>
             <w:r>
               <w:t xml:space="preserve">68.40</w:t>
@@ -2534,7 +2556,7 @@
           <w:p>
             <w:pPr>
               <w:pStyle w:val="Compact"/>
-              <w:jc w:val="left"/>
+              <w:jc w:val="right"/>
             </w:pPr>
             <w:r>
               <w:t xml:space="preserve">50</w:t>
@@ -2546,7 +2568,7 @@
           <w:p>
             <w:pPr>
               <w:pStyle w:val="Compact"/>
-              <w:jc w:val="left"/>
+              <w:jc w:val="right"/>
             </w:pPr>
             <w:r>
               <w:t xml:space="preserve">52</w:t>
@@ -2558,7 +2580,7 @@
           <w:p>
             <w:pPr>
               <w:pStyle w:val="Compact"/>
-              <w:jc w:val="left"/>
+              <w:jc w:val="right"/>
             </w:pPr>
             <w:r>
               <w:t xml:space="preserve">49</w:t>
@@ -2570,7 +2592,7 @@
           <w:p>
             <w:pPr>
               <w:pStyle w:val="Compact"/>
-              <w:jc w:val="left"/>
+              <w:jc w:val="right"/>
             </w:pPr>
             <w:r>
               <w:t xml:space="preserve">2060.6</w:t>
@@ -2582,7 +2604,7 @@
           <w:p>
             <w:pPr>
               <w:pStyle w:val="Compact"/>
-              <w:jc w:val="left"/>
+              <w:jc w:val="right"/>
             </w:pPr>
             <w:r>
               <w:t xml:space="preserve">23.78</w:t>
@@ -2620,7 +2642,7 @@
           <w:p>
             <w:pPr>
               <w:pStyle w:val="Compact"/>
-              <w:jc w:val="left"/>
+              <w:jc w:val="right"/>
             </w:pPr>
             <w:r>
               <w:t xml:space="preserve">9</w:t>
@@ -2632,7 +2654,7 @@
           <w:p>
             <w:pPr>
               <w:pStyle w:val="Compact"/>
-              <w:jc w:val="left"/>
+              <w:jc w:val="right"/>
             </w:pPr>
             <w:r>
               <w:t xml:space="preserve">9</w:t>
@@ -2644,7 +2666,7 @@
           <w:p>
             <w:pPr>
               <w:pStyle w:val="Compact"/>
-              <w:jc w:val="left"/>
+              <w:jc w:val="right"/>
             </w:pPr>
             <w:r>
               <w:t xml:space="preserve">7</w:t>
@@ -2656,7 +2678,7 @@
           <w:p>
             <w:pPr>
               <w:pStyle w:val="Compact"/>
-              <w:jc w:val="left"/>
+              <w:jc w:val="right"/>
             </w:pPr>
             <w:r>
               <w:t xml:space="preserve">2670.0</w:t>
@@ -2668,7 +2690,7 @@
           <w:p>
             <w:pPr>
               <w:pStyle w:val="Compact"/>
-              <w:jc w:val="left"/>
+              <w:jc w:val="right"/>
             </w:pPr>
             <w:r>
               <w:t xml:space="preserve">2.62</w:t>
@@ -2706,7 +2728,7 @@
           <w:p>
             <w:pPr>
               <w:pStyle w:val="Compact"/>
-              <w:jc w:val="left"/>
+              <w:jc w:val="right"/>
             </w:pPr>
             <w:r>
               <w:t xml:space="preserve">9</w:t>
@@ -2718,7 +2740,7 @@
           <w:p>
             <w:pPr>
               <w:pStyle w:val="Compact"/>
-              <w:jc w:val="left"/>
+              <w:jc w:val="right"/>
             </w:pPr>
             <w:r>
               <w:t xml:space="preserve">9</w:t>
@@ -2730,7 +2752,7 @@
           <w:p>
             <w:pPr>
               <w:pStyle w:val="Compact"/>
-              <w:jc w:val="left"/>
+              <w:jc w:val="right"/>
             </w:pPr>
             <w:r>
               <w:t xml:space="preserve">7</w:t>
@@ -2742,7 +2764,7 @@
           <w:p>
             <w:pPr>
               <w:pStyle w:val="Compact"/>
-              <w:jc w:val="left"/>
+              <w:jc w:val="right"/>
             </w:pPr>
             <w:r>
               <w:t xml:space="preserve">438.2</w:t>
@@ -2754,7 +2776,7 @@
           <w:p>
             <w:pPr>
               <w:pStyle w:val="Compact"/>
-              <w:jc w:val="left"/>
+              <w:jc w:val="right"/>
             </w:pPr>
             <w:r>
               <w:t xml:space="preserve">15.97</w:t>
@@ -2792,7 +2814,7 @@
           <w:p>
             <w:pPr>
               <w:pStyle w:val="Compact"/>
-              <w:jc w:val="left"/>
+              <w:jc w:val="right"/>
             </w:pPr>
             <w:r>
               <w:t xml:space="preserve">9</w:t>
@@ -2804,7 +2826,7 @@
           <w:p>
             <w:pPr>
               <w:pStyle w:val="Compact"/>
-              <w:jc w:val="left"/>
+              <w:jc w:val="right"/>
             </w:pPr>
             <w:r>
               <w:t xml:space="preserve">9</w:t>
@@ -2816,7 +2838,7 @@
           <w:p>
             <w:pPr>
               <w:pStyle w:val="Compact"/>
-              <w:jc w:val="left"/>
+              <w:jc w:val="right"/>
             </w:pPr>
             <w:r>
               <w:t xml:space="preserve">7</w:t>
@@ -2828,7 +2850,7 @@
           <w:p>
             <w:pPr>
               <w:pStyle w:val="Compact"/>
-              <w:jc w:val="left"/>
+              <w:jc w:val="right"/>
             </w:pPr>
             <w:r>
               <w:t xml:space="preserve">2574.7</w:t>
@@ -2840,7 +2862,7 @@
           <w:p>
             <w:pPr>
               <w:pStyle w:val="Compact"/>
-              <w:jc w:val="left"/>
+              <w:jc w:val="right"/>
             </w:pPr>
             <w:r>
               <w:t xml:space="preserve">2.72</w:t>
@@ -2878,7 +2900,7 @@
           <w:p>
             <w:pPr>
               <w:pStyle w:val="Compact"/>
-              <w:jc w:val="left"/>
+              <w:jc w:val="right"/>
             </w:pPr>
             <w:r>
               <w:t xml:space="preserve">19</w:t>
@@ -2890,7 +2912,7 @@
           <w:p>
             <w:pPr>
               <w:pStyle w:val="Compact"/>
-              <w:jc w:val="left"/>
+              <w:jc w:val="right"/>
             </w:pPr>
             <w:r>
               <w:t xml:space="preserve">23</w:t>
@@ -2902,7 +2924,7 @@
           <w:p>
             <w:pPr>
               <w:pStyle w:val="Compact"/>
-              <w:jc w:val="left"/>
+              <w:jc w:val="right"/>
             </w:pPr>
             <w:r>
               <w:t xml:space="preserve">20</w:t>
@@ -2914,7 +2936,7 @@
           <w:p>
             <w:pPr>
               <w:pStyle w:val="Compact"/>
-              <w:jc w:val="left"/>
+              <w:jc w:val="right"/>
             </w:pPr>
             <w:r>
               <w:t xml:space="preserve">1585.6</w:t>
@@ -2926,7 +2948,7 @@
           <w:p>
             <w:pPr>
               <w:pStyle w:val="Compact"/>
-              <w:jc w:val="left"/>
+              <w:jc w:val="right"/>
             </w:pPr>
             <w:r>
               <w:t xml:space="preserve">12.61</w:t>
@@ -2964,7 +2986,7 @@
           <w:p>
             <w:pPr>
               <w:pStyle w:val="Compact"/>
-              <w:jc w:val="left"/>
+              <w:jc w:val="right"/>
             </w:pPr>
             <w:r>
               <w:t xml:space="preserve">19</w:t>
@@ -2976,7 +2998,7 @@
           <w:p>
             <w:pPr>
               <w:pStyle w:val="Compact"/>
-              <w:jc w:val="left"/>
+              <w:jc w:val="right"/>
             </w:pPr>
             <w:r>
               <w:t xml:space="preserve">23</w:t>
@@ -2988,7 +3010,7 @@
           <w:p>
             <w:pPr>
               <w:pStyle w:val="Compact"/>
-              <w:jc w:val="left"/>
+              <w:jc w:val="right"/>
             </w:pPr>
             <w:r>
               <w:t xml:space="preserve">20</w:t>
@@ -3000,7 +3022,7 @@
           <w:p>
             <w:pPr>
               <w:pStyle w:val="Compact"/>
-              <w:jc w:val="left"/>
+              <w:jc w:val="right"/>
             </w:pPr>
             <w:r>
               <w:t xml:space="preserve">2440.3</w:t>
@@ -3012,7 +3034,7 @@
           <w:p>
             <w:pPr>
               <w:pStyle w:val="Compact"/>
-              <w:jc w:val="left"/>
+              <w:jc w:val="right"/>
             </w:pPr>
             <w:r>
               <w:t xml:space="preserve">8.20</w:t>
@@ -3050,7 +3072,7 @@
           <w:p>
             <w:pPr>
               <w:pStyle w:val="Compact"/>
-              <w:jc w:val="left"/>
+              <w:jc w:val="right"/>
             </w:pPr>
             <w:r>
               <w:t xml:space="preserve">16</w:t>
@@ -3062,7 +3084,7 @@
           <w:p>
             <w:pPr>
               <w:pStyle w:val="Compact"/>
-              <w:jc w:val="left"/>
+              <w:jc w:val="right"/>
             </w:pPr>
             <w:r>
               <w:t xml:space="preserve">17</w:t>
@@ -3074,7 +3096,7 @@
           <w:p>
             <w:pPr>
               <w:pStyle w:val="Compact"/>
-              <w:jc w:val="left"/>
+              <w:jc w:val="right"/>
             </w:pPr>
             <w:r>
               <w:t xml:space="preserve">15</w:t>
@@ -3086,7 +3108,7 @@
           <w:p>
             <w:pPr>
               <w:pStyle w:val="Compact"/>
-              <w:jc w:val="left"/>
+              <w:jc w:val="right"/>
             </w:pPr>
             <w:r>
               <w:t xml:space="preserve">669.5</w:t>
@@ -3098,7 +3120,7 @@
           <w:p>
             <w:pPr>
               <w:pStyle w:val="Compact"/>
-              <w:jc w:val="left"/>
+              <w:jc w:val="right"/>
             </w:pPr>
             <w:r>
               <w:t xml:space="preserve">22.40</w:t>
@@ -3136,7 +3158,7 @@
           <w:p>
             <w:pPr>
               <w:pStyle w:val="Compact"/>
-              <w:jc w:val="left"/>
+              <w:jc w:val="right"/>
             </w:pPr>
             <w:r>
               <w:t xml:space="preserve">16</w:t>
@@ -3148,7 +3170,7 @@
           <w:p>
             <w:pPr>
               <w:pStyle w:val="Compact"/>
-              <w:jc w:val="left"/>
+              <w:jc w:val="right"/>
             </w:pPr>
             <w:r>
               <w:t xml:space="preserve">17</w:t>
@@ -3160,7 +3182,7 @@
           <w:p>
             <w:pPr>
               <w:pStyle w:val="Compact"/>
-              <w:jc w:val="left"/>
+              <w:jc w:val="right"/>
             </w:pPr>
             <w:r>
               <w:t xml:space="preserve">15</w:t>
@@ -3172,7 +3194,7 @@
           <w:p>
             <w:pPr>
               <w:pStyle w:val="Compact"/>
-              <w:jc w:val="left"/>
+              <w:jc w:val="right"/>
             </w:pPr>
             <w:r>
               <w:t xml:space="preserve">1179.1</w:t>
@@ -3184,7 +3206,7 @@
           <w:p>
             <w:pPr>
               <w:pStyle w:val="Compact"/>
-              <w:jc w:val="left"/>
+              <w:jc w:val="right"/>
             </w:pPr>
             <w:r>
               <w:t xml:space="preserve">12.72</w:t>
@@ -3222,7 +3244,7 @@
           <w:p>
             <w:pPr>
               <w:pStyle w:val="Compact"/>
-              <w:jc w:val="left"/>
+              <w:jc w:val="right"/>
             </w:pPr>
             <w:r>
               <w:t xml:space="preserve">8</w:t>
@@ -3234,7 +3256,7 @@
           <w:p>
             <w:pPr>
               <w:pStyle w:val="Compact"/>
-              <w:jc w:val="left"/>
+              <w:jc w:val="right"/>
             </w:pPr>
             <w:r>
               <w:t xml:space="preserve">9</w:t>
@@ -3246,7 +3268,7 @@
           <w:p>
             <w:pPr>
               <w:pStyle w:val="Compact"/>
-              <w:jc w:val="left"/>
+              <w:jc w:val="right"/>
             </w:pPr>
             <w:r>
               <w:t xml:space="preserve">8</w:t>
@@ -3258,7 +3280,7 @@
           <w:p>
             <w:pPr>
               <w:pStyle w:val="Compact"/>
-              <w:jc w:val="left"/>
+              <w:jc w:val="right"/>
             </w:pPr>
             <w:r>
               <w:t xml:space="preserve">563.9</w:t>
@@ -3270,7 +3292,7 @@
           <w:p>
             <w:pPr>
               <w:pStyle w:val="Compact"/>
-              <w:jc w:val="left"/>
+              <w:jc w:val="right"/>
             </w:pPr>
             <w:r>
               <w:t xml:space="preserve">14.19</w:t>
@@ -3308,7 +3330,7 @@
           <w:p>
             <w:pPr>
               <w:pStyle w:val="Compact"/>
-              <w:jc w:val="left"/>
+              <w:jc w:val="right"/>
             </w:pPr>
             <w:r>
               <w:t xml:space="preserve">4</w:t>
@@ -3320,7 +3342,7 @@
           <w:p>
             <w:pPr>
               <w:pStyle w:val="Compact"/>
-              <w:jc w:val="left"/>
+              <w:jc w:val="right"/>
             </w:pPr>
             <w:r>
               <w:t xml:space="preserve">6</w:t>
@@ -3332,7 +3354,7 @@
           <w:p>
             <w:pPr>
               <w:pStyle w:val="Compact"/>
-              <w:jc w:val="left"/>
+              <w:jc w:val="right"/>
             </w:pPr>
             <w:r>
               <w:t xml:space="preserve">4</w:t>
@@ -3344,7 +3366,7 @@
           <w:p>
             <w:pPr>
               <w:pStyle w:val="Compact"/>
-              <w:jc w:val="left"/>
+              <w:jc w:val="right"/>
             </w:pPr>
             <w:r>
               <w:t xml:space="preserve">1043.2</w:t>
@@ -3356,7 +3378,7 @@
           <w:p>
             <w:pPr>
               <w:pStyle w:val="Compact"/>
-              <w:jc w:val="left"/>
+              <w:jc w:val="right"/>
             </w:pPr>
             <w:r>
               <w:t xml:space="preserve">3.83</w:t>
@@ -3394,7 +3416,7 @@
           <w:p>
             <w:pPr>
               <w:pStyle w:val="Compact"/>
-              <w:jc w:val="left"/>
+              <w:jc w:val="right"/>
             </w:pPr>
             <w:r>
               <w:t xml:space="preserve">23</w:t>
@@ -3406,7 +3428,7 @@
           <w:p>
             <w:pPr>
               <w:pStyle w:val="Compact"/>
-              <w:jc w:val="left"/>
+              <w:jc w:val="right"/>
             </w:pPr>
             <w:r>
               <w:t xml:space="preserve">20</w:t>
@@ -3418,7 +3440,7 @@
           <w:p>
             <w:pPr>
               <w:pStyle w:val="Compact"/>
-              <w:jc w:val="left"/>
+              <w:jc w:val="right"/>
             </w:pPr>
             <w:r>
               <w:t xml:space="preserve">20</w:t>
@@ -3430,7 +3452,7 @@
           <w:p>
             <w:pPr>
               <w:pStyle w:val="Compact"/>
-              <w:jc w:val="left"/>
+              <w:jc w:val="right"/>
             </w:pPr>
             <w:r>
               <w:t xml:space="preserve">3693.3</w:t>
@@ -3442,7 +3464,7 @@
           <w:p>
             <w:pPr>
               <w:pStyle w:val="Compact"/>
-              <w:jc w:val="left"/>
+              <w:jc w:val="right"/>
             </w:pPr>
             <w:r>
               <w:t xml:space="preserve">5.42</w:t>
@@ -3480,7 +3502,7 @@
           <w:p>
             <w:pPr>
               <w:pStyle w:val="Compact"/>
-              <w:jc w:val="left"/>
+              <w:jc w:val="right"/>
             </w:pPr>
             <w:r>
               <w:t xml:space="preserve">23</w:t>
@@ -3492,7 +3514,7 @@
           <w:p>
             <w:pPr>
               <w:pStyle w:val="Compact"/>
-              <w:jc w:val="left"/>
+              <w:jc w:val="right"/>
             </w:pPr>
             <w:r>
               <w:t xml:space="preserve">20</w:t>
@@ -3504,7 +3526,7 @@
           <w:p>
             <w:pPr>
               <w:pStyle w:val="Compact"/>
-              <w:jc w:val="left"/>
+              <w:jc w:val="right"/>
             </w:pPr>
             <w:r>
               <w:t xml:space="preserve">20</w:t>
@@ -3516,7 +3538,7 @@
           <w:p>
             <w:pPr>
               <w:pStyle w:val="Compact"/>
-              <w:jc w:val="left"/>
+              <w:jc w:val="right"/>
             </w:pPr>
             <w:r>
               <w:t xml:space="preserve">1183.3</w:t>
@@ -3528,7 +3550,7 @@
           <w:p>
             <w:pPr>
               <w:pStyle w:val="Compact"/>
-              <w:jc w:val="left"/>
+              <w:jc w:val="right"/>
             </w:pPr>
             <w:r>
               <w:t xml:space="preserve">16.90</w:t>
@@ -3566,7 +3588,7 @@
           <w:p>
             <w:pPr>
               <w:pStyle w:val="Compact"/>
-              <w:jc w:val="left"/>
+              <w:jc w:val="right"/>
             </w:pPr>
             <w:r>
               <w:t xml:space="preserve">65</w:t>
@@ -3578,7 +3600,7 @@
           <w:p>
             <w:pPr>
               <w:pStyle w:val="Compact"/>
-              <w:jc w:val="left"/>
+              <w:jc w:val="right"/>
             </w:pPr>
             <w:r>
               <w:t xml:space="preserve">57</w:t>
@@ -3590,7 +3612,7 @@
           <w:p>
             <w:pPr>
               <w:pStyle w:val="Compact"/>
-              <w:jc w:val="left"/>
+              <w:jc w:val="right"/>
             </w:pPr>
             <w:r>
               <w:t xml:space="preserve">56</w:t>
@@ -3602,7 +3624,7 @@
           <w:p>
             <w:pPr>
               <w:pStyle w:val="Compact"/>
-              <w:jc w:val="left"/>
+              <w:jc w:val="right"/>
             </w:pPr>
             <w:r>
               <w:t xml:space="preserve">4065.2</w:t>
@@ -3614,7 +3636,7 @@
           <w:p>
             <w:pPr>
               <w:pStyle w:val="Compact"/>
-              <w:jc w:val="left"/>
+              <w:jc w:val="right"/>
             </w:pPr>
             <w:r>
               <w:t xml:space="preserve">13.78</w:t>
@@ -3652,7 +3674,7 @@
           <w:p>
             <w:pPr>
               <w:pStyle w:val="Compact"/>
-              <w:jc w:val="left"/>
+              <w:jc w:val="right"/>
             </w:pPr>
             <w:r>
               <w:t xml:space="preserve">65</w:t>
@@ -3664,7 +3686,7 @@
           <w:p>
             <w:pPr>
               <w:pStyle w:val="Compact"/>
-              <w:jc w:val="left"/>
+              <w:jc w:val="right"/>
             </w:pPr>
             <w:r>
               <w:t xml:space="preserve">57</w:t>
@@ -3676,7 +3698,7 @@
           <w:p>
             <w:pPr>
               <w:pStyle w:val="Compact"/>
-              <w:jc w:val="left"/>
+              <w:jc w:val="right"/>
             </w:pPr>
             <w:r>
               <w:t xml:space="preserve">56</w:t>
@@ -3688,7 +3710,7 @@
           <w:p>
             <w:pPr>
               <w:pStyle w:val="Compact"/>
-              <w:jc w:val="left"/>
+              <w:jc w:val="right"/>
             </w:pPr>
             <w:r>
               <w:t xml:space="preserve">1252.5</w:t>
@@ -3700,7 +3722,7 @@
           <w:p>
             <w:pPr>
               <w:pStyle w:val="Compact"/>
-              <w:jc w:val="left"/>
+              <w:jc w:val="right"/>
             </w:pPr>
             <w:r>
               <w:t xml:space="preserve">44.71</w:t>
@@ -3738,7 +3760,7 @@
           <w:p>
             <w:pPr>
               <w:pStyle w:val="Compact"/>
-              <w:jc w:val="left"/>
+              <w:jc w:val="right"/>
             </w:pPr>
             <w:r>
               <w:t xml:space="preserve">26</w:t>
@@ -3750,7 +3772,7 @@
           <w:p>
             <w:pPr>
               <w:pStyle w:val="Compact"/>
-              <w:jc w:val="left"/>
+              <w:jc w:val="right"/>
             </w:pPr>
             <w:r>
               <w:t xml:space="preserve">24</w:t>
@@ -3762,7 +3784,7 @@
           <w:p>
             <w:pPr>
               <w:pStyle w:val="Compact"/>
-              <w:jc w:val="left"/>
+              <w:jc w:val="right"/>
             </w:pPr>
             <w:r>
               <w:t xml:space="preserve">24</w:t>
@@ -3774,7 +3796,7 @@
           <w:p>
             <w:pPr>
               <w:pStyle w:val="Compact"/>
-              <w:jc w:val="left"/>
+              <w:jc w:val="right"/>
             </w:pPr>
             <w:r>
               <w:t xml:space="preserve">940.2</w:t>
@@ -3786,7 +3808,7 @@
           <w:p>
             <w:pPr>
               <w:pStyle w:val="Compact"/>
-              <w:jc w:val="left"/>
+              <w:jc w:val="right"/>
             </w:pPr>
             <w:r>
               <w:t xml:space="preserve">25.53</w:t>
@@ -3824,7 +3846,7 @@
           <w:p>
             <w:pPr>
               <w:pStyle w:val="Compact"/>
-              <w:jc w:val="left"/>
+              <w:jc w:val="right"/>
             </w:pPr>
             <w:r>
               <w:t xml:space="preserve">26</w:t>
@@ -3836,7 +3858,7 @@
           <w:p>
             <w:pPr>
               <w:pStyle w:val="Compact"/>
-              <w:jc w:val="left"/>
+              <w:jc w:val="right"/>
             </w:pPr>
             <w:r>
               <w:t xml:space="preserve">24</w:t>
@@ -3848,7 +3870,7 @@
           <w:p>
             <w:pPr>
               <w:pStyle w:val="Compact"/>
-              <w:jc w:val="left"/>
+              <w:jc w:val="right"/>
             </w:pPr>
             <w:r>
               <w:t xml:space="preserve">24</w:t>
@@ -3860,7 +3882,7 @@
           <w:p>
             <w:pPr>
               <w:pStyle w:val="Compact"/>
-              <w:jc w:val="left"/>
+              <w:jc w:val="right"/>
             </w:pPr>
             <w:r>
               <w:t xml:space="preserve">783.4</w:t>
@@ -3872,7 +3894,7 @@
           <w:p>
             <w:pPr>
               <w:pStyle w:val="Compact"/>
-              <w:jc w:val="left"/>
+              <w:jc w:val="right"/>
             </w:pPr>
             <w:r>
               <w:t xml:space="preserve">30.64</w:t>
@@ -3910,7 +3932,7 @@
           <w:p>
             <w:pPr>
               <w:pStyle w:val="Compact"/>
-              <w:jc w:val="left"/>
+              <w:jc w:val="right"/>
             </w:pPr>
             <w:r>
               <w:t xml:space="preserve">9</w:t>
@@ -3922,7 +3944,7 @@
           <w:p>
             <w:pPr>
               <w:pStyle w:val="Compact"/>
-              <w:jc w:val="left"/>
+              <w:jc w:val="right"/>
             </w:pPr>
             <w:r>
               <w:t xml:space="preserve">8</w:t>
@@ -3934,7 +3956,7 @@
           <w:p>
             <w:pPr>
               <w:pStyle w:val="Compact"/>
-              <w:jc w:val="left"/>
+              <w:jc w:val="right"/>
             </w:pPr>
             <w:r>
               <w:t xml:space="preserve">8</w:t>
@@ -3946,7 +3968,7 @@
           <w:p>
             <w:pPr>
               <w:pStyle w:val="Compact"/>
-              <w:jc w:val="left"/>
+              <w:jc w:val="right"/>
             </w:pPr>
             <w:r>
               <w:t xml:space="preserve">1711.1</w:t>
@@ -3958,7 +3980,7 @@
           <w:p>
             <w:pPr>
               <w:pStyle w:val="Compact"/>
-              <w:jc w:val="left"/>
+              <w:jc w:val="right"/>
             </w:pPr>
             <w:r>
               <w:t xml:space="preserve">4.68</w:t>
@@ -3996,7 +4018,7 @@
           <w:p>
             <w:pPr>
               <w:pStyle w:val="Compact"/>
-              <w:jc w:val="left"/>
+              <w:jc w:val="right"/>
             </w:pPr>
             <w:r>
               <w:t xml:space="preserve">9</w:t>
@@ -4008,7 +4030,7 @@
           <w:p>
             <w:pPr>
               <w:pStyle w:val="Compact"/>
-              <w:jc w:val="left"/>
+              <w:jc w:val="right"/>
             </w:pPr>
             <w:r>
               <w:t xml:space="preserve">8</w:t>
@@ -4020,7 +4042,7 @@
           <w:p>
             <w:pPr>
               <w:pStyle w:val="Compact"/>
-              <w:jc w:val="left"/>
+              <w:jc w:val="right"/>
             </w:pPr>
             <w:r>
               <w:t xml:space="preserve">8</w:t>
@@ -4032,7 +4054,7 @@
           <w:p>
             <w:pPr>
               <w:pStyle w:val="Compact"/>
-              <w:jc w:val="left"/>
+              <w:jc w:val="right"/>
             </w:pPr>
             <w:r>
               <w:t xml:space="preserve">1561.4</w:t>
@@ -4044,7 +4066,7 @@
           <w:p>
             <w:pPr>
               <w:pStyle w:val="Compact"/>
-              <w:jc w:val="left"/>
+              <w:jc w:val="right"/>
             </w:pPr>
             <w:r>
               <w:t xml:space="preserve">5.12</w:t>
@@ -4065,7 +4087,7 @@
         <w:pStyle w:val="TableCaption"/>
       </w:pPr>
       <w:r>
-        <w:t xml:space="preserve">Table 2: Target numbers of length samples for each managed species.</w:t>
+        <w:t xml:space="preserve">Table 2: Target numbers of length samples for each managed species.</w:t>
       </w:r>
     </w:p>
     <w:tbl>
@@ -4073,7 +4095,7 @@
         <w:tblStyle w:val="Table"/>
         <w:tblW w:type="auto" w:w="0"/>
         <w:tblLook w:firstRow="1" w:lastRow="0" w:firstColumn="0" w:lastColumn="0" w:noHBand="0" w:noVBand="0" w:val="0020"/>
-        <w:tblCaption w:val="Table 2: Target numbers of length samples for each managed species."/>
+        <w:tblCaption w:val="Table 2: Target numbers of length samples for each managed species."/>
       </w:tblPr>
       <w:tblGrid>
         <w:gridCol w:w="3960"/>
@@ -4604,6 +4626,11 @@
       </w:tr>
     </w:tbl>
     <w:bookmarkEnd w:id="21"/>
+    <w:p>
+      <w:r>
+        <w:br w:type="page"/>
+      </w:r>
+    </w:p>
     <w:tbl>
       <w:tblPr>
         <w:tblStyle w:val="Table"/>
@@ -4616,6 +4643,7 @@
       <w:tr>
         <w:tc>
           <w:tcPr/>
+          <w:bookmarkStart w:id="25" w:name="fig-area-map"/>
           <w:p>
             <w:pPr>
               <w:pStyle w:val="Figure"/>
@@ -4674,14 +4702,15 @@
               <w:pStyle w:val="ImageCaption"/>
             </w:pPr>
             <w:r>
-              <w:t xml:space="preserve">Map of the Aleutian Islands 2018 bottom trawl survey area indicating survey districts (WAI = Western Aleutian Islands, CAI = Central Aleutian Islands, EAI = Eastern Aleutian Islands, and SBS = Southern Bering Sea), isobaths from 100–500 m and stations sampled (black dots).</w:t>
-            </w:r>
-          </w:p>
+              <w:t xml:space="preserve">Figure 1: Map of the Aleutian Islands 2018 bottom trawl survey area indicating survey districts (WAI = Western Aleutian Islands, CAI = Central Aleutian Islands, EAI = Eastern Aleutian Islands, and SBS = Southern Bering Sea), isobaths from 100–500 m and stations sampled (black dots).</w:t>
+            </w:r>
+          </w:p>
+          <w:bookmarkEnd w:id="25"/>
         </w:tc>
       </w:tr>
     </w:tbl>
-    <w:bookmarkStart w:id="27" w:name="refs"/>
-    <w:bookmarkStart w:id="26" w:name="ref-rugolo_examination_2020"/>
+    <w:bookmarkStart w:id="28" w:name="refs"/>
+    <w:bookmarkStart w:id="27" w:name="ref-rugolo_examination_2020"/>
     <w:p>
       <w:pPr>
         <w:pStyle w:val="Bibliography"/>
@@ -4692,7 +4721,7 @@
       <w:r>
         <w:t xml:space="preserve"> </w:t>
       </w:r>
-      <w:hyperlink r:id="rId25">
+      <w:hyperlink r:id="rId26">
         <w:r>
           <w:rPr>
             <w:rStyle w:val="Hyperlink"/>
@@ -4836,8 +4865,8 @@
         <w:t xml:space="preserve">.</w:t>
       </w:r>
     </w:p>
-    <w:bookmarkEnd w:id="26"/>
     <w:bookmarkEnd w:id="27"/>
+    <w:bookmarkEnd w:id="28"/>
     <w:sectPr/>
   </w:body>
 </w:document>

</xml_diff>